<commit_message>
Move Markdown sources into Documents/markdown
Word and PDF copies stay in Documents/. Image and cross-document paths updated; Word/PDF rebuilt so their path references match.
</commit_message>
<xml_diff>
--- a/Documents/SRS.docx
+++ b/Documents/SRS.docx
@@ -102,7 +102,7 @@
         <w:rPr>
           <w:rFonts w:ascii="Consolas" w:hAnsi="Consolas"/>
         </w:rPr>
-        <w:t>Documents/SAD.md</w:t>
+        <w:t>Documents/markdown/SAD.md</w:t>
       </w:r>
       <w:r>
         <w:t>) and the Test Plan (</w:t>
@@ -111,7 +111,7 @@
         <w:rPr>
           <w:rFonts w:ascii="Consolas" w:hAnsi="Consolas"/>
         </w:rPr>
-        <w:t>Documents/Test_Plan.md</w:t>
+        <w:t>Documents/markdown/Test_Plan.md</w:t>
       </w:r>
       <w:r>
         <w:t>).</w:t>
@@ -4989,7 +4989,7 @@
         </w:trPr>
         <w:tc>
           <w:tcPr>
-            <w:tcW w:type="dxa" w:w="1064"/>
+            <w:tcW w:type="dxa" w:w="1063"/>
             <w:shd w:val="clear" w:color="auto" w:fill="D9E2F3"/>
           </w:tcPr>
           <w:p>
@@ -5029,7 +5029,7 @@
         </w:tc>
         <w:tc>
           <w:tcPr>
-            <w:tcW w:type="dxa" w:w="3664"/>
+            <w:tcW w:type="dxa" w:w="3660"/>
             <w:shd w:val="clear" w:color="auto" w:fill="D9E2F3"/>
           </w:tcPr>
           <w:p>
@@ -5049,7 +5049,7 @@
         </w:tc>
         <w:tc>
           <w:tcPr>
-            <w:tcW w:type="dxa" w:w="1156"/>
+            <w:tcW w:type="dxa" w:w="1155"/>
             <w:shd w:val="clear" w:color="auto" w:fill="D9E2F3"/>
           </w:tcPr>
           <w:p>
@@ -5069,7 +5069,7 @@
         </w:tc>
         <w:tc>
           <w:tcPr>
-            <w:tcW w:type="dxa" w:w="3256"/>
+            <w:tcW w:type="dxa" w:w="3261"/>
             <w:shd w:val="clear" w:color="auto" w:fill="D9E2F3"/>
           </w:tcPr>
           <w:p>
@@ -5089,7 +5089,7 @@
         </w:tc>
         <w:tc>
           <w:tcPr>
-            <w:tcW w:type="dxa" w:w="2300"/>
+            <w:tcW w:type="dxa" w:w="2299"/>
             <w:shd w:val="clear" w:color="auto" w:fill="D9E2F3"/>
           </w:tcPr>
           <w:p>
@@ -5109,7 +5109,7 @@
         </w:tc>
         <w:tc>
           <w:tcPr>
-            <w:tcW w:type="dxa" w:w="1198"/>
+            <w:tcW w:type="dxa" w:w="1197"/>
             <w:shd w:val="clear" w:color="auto" w:fill="D9E2F3"/>
           </w:tcPr>
           <w:p>
@@ -5131,7 +5131,7 @@
       <w:tr>
         <w:tc>
           <w:tcPr>
-            <w:tcW w:type="dxa" w:w="1064"/>
+            <w:tcW w:type="dxa" w:w="1063"/>
           </w:tcPr>
           <w:p>
             <w:r/>
@@ -5159,7 +5159,7 @@
         </w:tc>
         <w:tc>
           <w:tcPr>
-            <w:tcW w:type="dxa" w:w="3664"/>
+            <w:tcW w:type="dxa" w:w="3660"/>
           </w:tcPr>
           <w:p>
             <w:r/>
@@ -5173,7 +5173,7 @@
         </w:tc>
         <w:tc>
           <w:tcPr>
-            <w:tcW w:type="dxa" w:w="1156"/>
+            <w:tcW w:type="dxa" w:w="1155"/>
           </w:tcPr>
           <w:p>
             <w:r/>
@@ -5187,7 +5187,7 @@
         </w:tc>
         <w:tc>
           <w:tcPr>
-            <w:tcW w:type="dxa" w:w="3256"/>
+            <w:tcW w:type="dxa" w:w="3261"/>
           </w:tcPr>
           <w:p>
             <w:r/>
@@ -5201,7 +5201,7 @@
         </w:tc>
         <w:tc>
           <w:tcPr>
-            <w:tcW w:type="dxa" w:w="2300"/>
+            <w:tcW w:type="dxa" w:w="2299"/>
           </w:tcPr>
           <w:p>
             <w:r/>
@@ -5215,7 +5215,7 @@
         </w:tc>
         <w:tc>
           <w:tcPr>
-            <w:tcW w:type="dxa" w:w="1198"/>
+            <w:tcW w:type="dxa" w:w="1197"/>
           </w:tcPr>
           <w:p>
             <w:r/>
@@ -5231,7 +5231,7 @@
       <w:tr>
         <w:tc>
           <w:tcPr>
-            <w:tcW w:type="dxa" w:w="1064"/>
+            <w:tcW w:type="dxa" w:w="1063"/>
           </w:tcPr>
           <w:p>
             <w:r/>
@@ -5259,7 +5259,7 @@
         </w:tc>
         <w:tc>
           <w:tcPr>
-            <w:tcW w:type="dxa" w:w="3664"/>
+            <w:tcW w:type="dxa" w:w="3660"/>
           </w:tcPr>
           <w:p>
             <w:r/>
@@ -5273,7 +5273,7 @@
         </w:tc>
         <w:tc>
           <w:tcPr>
-            <w:tcW w:type="dxa" w:w="1156"/>
+            <w:tcW w:type="dxa" w:w="1155"/>
           </w:tcPr>
           <w:p>
             <w:r/>
@@ -5287,7 +5287,7 @@
         </w:tc>
         <w:tc>
           <w:tcPr>
-            <w:tcW w:type="dxa" w:w="3256"/>
+            <w:tcW w:type="dxa" w:w="3261"/>
           </w:tcPr>
           <w:p>
             <w:r/>
@@ -5301,7 +5301,7 @@
         </w:tc>
         <w:tc>
           <w:tcPr>
-            <w:tcW w:type="dxa" w:w="2300"/>
+            <w:tcW w:type="dxa" w:w="2299"/>
           </w:tcPr>
           <w:p>
             <w:r/>
@@ -5315,7 +5315,7 @@
         </w:tc>
         <w:tc>
           <w:tcPr>
-            <w:tcW w:type="dxa" w:w="1198"/>
+            <w:tcW w:type="dxa" w:w="1197"/>
           </w:tcPr>
           <w:p>
             <w:r/>
@@ -5331,7 +5331,7 @@
       <w:tr>
         <w:tc>
           <w:tcPr>
-            <w:tcW w:type="dxa" w:w="1064"/>
+            <w:tcW w:type="dxa" w:w="1063"/>
           </w:tcPr>
           <w:p>
             <w:r/>
@@ -5359,7 +5359,7 @@
         </w:tc>
         <w:tc>
           <w:tcPr>
-            <w:tcW w:type="dxa" w:w="3664"/>
+            <w:tcW w:type="dxa" w:w="3660"/>
           </w:tcPr>
           <w:p>
             <w:r/>
@@ -5373,7 +5373,7 @@
         </w:tc>
         <w:tc>
           <w:tcPr>
-            <w:tcW w:type="dxa" w:w="1156"/>
+            <w:tcW w:type="dxa" w:w="1155"/>
           </w:tcPr>
           <w:p>
             <w:r/>
@@ -5387,7 +5387,7 @@
         </w:tc>
         <w:tc>
           <w:tcPr>
-            <w:tcW w:type="dxa" w:w="3256"/>
+            <w:tcW w:type="dxa" w:w="3261"/>
           </w:tcPr>
           <w:p>
             <w:r/>
@@ -5401,7 +5401,7 @@
         </w:tc>
         <w:tc>
           <w:tcPr>
-            <w:tcW w:type="dxa" w:w="2300"/>
+            <w:tcW w:type="dxa" w:w="2299"/>
           </w:tcPr>
           <w:p>
             <w:r/>
@@ -5415,7 +5415,7 @@
         </w:tc>
         <w:tc>
           <w:tcPr>
-            <w:tcW w:type="dxa" w:w="1198"/>
+            <w:tcW w:type="dxa" w:w="1197"/>
           </w:tcPr>
           <w:p>
             <w:r/>
@@ -5431,7 +5431,7 @@
       <w:tr>
         <w:tc>
           <w:tcPr>
-            <w:tcW w:type="dxa" w:w="1064"/>
+            <w:tcW w:type="dxa" w:w="1063"/>
           </w:tcPr>
           <w:p>
             <w:r/>
@@ -5459,7 +5459,7 @@
         </w:tc>
         <w:tc>
           <w:tcPr>
-            <w:tcW w:type="dxa" w:w="3664"/>
+            <w:tcW w:type="dxa" w:w="3660"/>
           </w:tcPr>
           <w:p>
             <w:r/>
@@ -5473,7 +5473,7 @@
         </w:tc>
         <w:tc>
           <w:tcPr>
-            <w:tcW w:type="dxa" w:w="1156"/>
+            <w:tcW w:type="dxa" w:w="1155"/>
           </w:tcPr>
           <w:p>
             <w:r/>
@@ -5487,7 +5487,7 @@
         </w:tc>
         <w:tc>
           <w:tcPr>
-            <w:tcW w:type="dxa" w:w="3256"/>
+            <w:tcW w:type="dxa" w:w="3261"/>
           </w:tcPr>
           <w:p>
             <w:r/>
@@ -5501,7 +5501,7 @@
         </w:tc>
         <w:tc>
           <w:tcPr>
-            <w:tcW w:type="dxa" w:w="2300"/>
+            <w:tcW w:type="dxa" w:w="2299"/>
           </w:tcPr>
           <w:p>
             <w:r/>
@@ -5515,7 +5515,7 @@
         </w:tc>
         <w:tc>
           <w:tcPr>
-            <w:tcW w:type="dxa" w:w="1198"/>
+            <w:tcW w:type="dxa" w:w="1197"/>
           </w:tcPr>
           <w:p>
             <w:r/>
@@ -5531,7 +5531,7 @@
       <w:tr>
         <w:tc>
           <w:tcPr>
-            <w:tcW w:type="dxa" w:w="1064"/>
+            <w:tcW w:type="dxa" w:w="1063"/>
           </w:tcPr>
           <w:p>
             <w:r/>
@@ -5559,7 +5559,7 @@
         </w:tc>
         <w:tc>
           <w:tcPr>
-            <w:tcW w:type="dxa" w:w="3664"/>
+            <w:tcW w:type="dxa" w:w="3660"/>
           </w:tcPr>
           <w:p>
             <w:r/>
@@ -5573,7 +5573,7 @@
         </w:tc>
         <w:tc>
           <w:tcPr>
-            <w:tcW w:type="dxa" w:w="1156"/>
+            <w:tcW w:type="dxa" w:w="1155"/>
           </w:tcPr>
           <w:p>
             <w:r/>
@@ -5587,7 +5587,7 @@
         </w:tc>
         <w:tc>
           <w:tcPr>
-            <w:tcW w:type="dxa" w:w="3256"/>
+            <w:tcW w:type="dxa" w:w="3261"/>
           </w:tcPr>
           <w:p>
             <w:r/>
@@ -5601,7 +5601,7 @@
         </w:tc>
         <w:tc>
           <w:tcPr>
-            <w:tcW w:type="dxa" w:w="2300"/>
+            <w:tcW w:type="dxa" w:w="2299"/>
           </w:tcPr>
           <w:p>
             <w:r/>
@@ -5615,7 +5615,7 @@
         </w:tc>
         <w:tc>
           <w:tcPr>
-            <w:tcW w:type="dxa" w:w="1198"/>
+            <w:tcW w:type="dxa" w:w="1197"/>
           </w:tcPr>
           <w:p>
             <w:r/>
@@ -5631,7 +5631,7 @@
       <w:tr>
         <w:tc>
           <w:tcPr>
-            <w:tcW w:type="dxa" w:w="1064"/>
+            <w:tcW w:type="dxa" w:w="1063"/>
           </w:tcPr>
           <w:p>
             <w:r/>
@@ -5659,7 +5659,7 @@
         </w:tc>
         <w:tc>
           <w:tcPr>
-            <w:tcW w:type="dxa" w:w="3664"/>
+            <w:tcW w:type="dxa" w:w="3660"/>
           </w:tcPr>
           <w:p>
             <w:r/>
@@ -5686,7 +5686,7 @@
         </w:tc>
         <w:tc>
           <w:tcPr>
-            <w:tcW w:type="dxa" w:w="1156"/>
+            <w:tcW w:type="dxa" w:w="1155"/>
           </w:tcPr>
           <w:p>
             <w:r/>
@@ -5700,7 +5700,7 @@
         </w:tc>
         <w:tc>
           <w:tcPr>
-            <w:tcW w:type="dxa" w:w="3256"/>
+            <w:tcW w:type="dxa" w:w="3261"/>
           </w:tcPr>
           <w:p>
             <w:r/>
@@ -5727,7 +5727,7 @@
         </w:tc>
         <w:tc>
           <w:tcPr>
-            <w:tcW w:type="dxa" w:w="2300"/>
+            <w:tcW w:type="dxa" w:w="2299"/>
           </w:tcPr>
           <w:p>
             <w:r/>
@@ -5754,7 +5754,7 @@
         </w:tc>
         <w:tc>
           <w:tcPr>
-            <w:tcW w:type="dxa" w:w="1198"/>
+            <w:tcW w:type="dxa" w:w="1197"/>
           </w:tcPr>
           <w:p>
             <w:r/>
@@ -5770,7 +5770,7 @@
       <w:tr>
         <w:tc>
           <w:tcPr>
-            <w:tcW w:type="dxa" w:w="1064"/>
+            <w:tcW w:type="dxa" w:w="1063"/>
           </w:tcPr>
           <w:p>
             <w:r/>
@@ -5798,7 +5798,7 @@
         </w:tc>
         <w:tc>
           <w:tcPr>
-            <w:tcW w:type="dxa" w:w="3664"/>
+            <w:tcW w:type="dxa" w:w="3660"/>
           </w:tcPr>
           <w:p>
             <w:r/>
@@ -5812,7 +5812,7 @@
         </w:tc>
         <w:tc>
           <w:tcPr>
-            <w:tcW w:type="dxa" w:w="1156"/>
+            <w:tcW w:type="dxa" w:w="1155"/>
           </w:tcPr>
           <w:p>
             <w:r/>
@@ -5826,7 +5826,7 @@
         </w:tc>
         <w:tc>
           <w:tcPr>
-            <w:tcW w:type="dxa" w:w="3256"/>
+            <w:tcW w:type="dxa" w:w="3261"/>
           </w:tcPr>
           <w:p>
             <w:r/>
@@ -5841,7 +5841,7 @@
                 <w:rFonts w:ascii="Consolas" w:hAnsi="Consolas"/>
                 <w:sz w:val="18"/>
               </w:rPr>
-              <w:t>Documents/Test_Plan.md</w:t>
+              <w:t>Documents/markdown/Test_Plan.md</w:t>
             </w:r>
             <w:r>
               <w:rPr>
@@ -5853,7 +5853,7 @@
         </w:tc>
         <w:tc>
           <w:tcPr>
-            <w:tcW w:type="dxa" w:w="2300"/>
+            <w:tcW w:type="dxa" w:w="2299"/>
           </w:tcPr>
           <w:p>
             <w:r/>
@@ -5867,7 +5867,7 @@
         </w:tc>
         <w:tc>
           <w:tcPr>
-            <w:tcW w:type="dxa" w:w="1198"/>
+            <w:tcW w:type="dxa" w:w="1197"/>
           </w:tcPr>
           <w:p>
             <w:r/>
@@ -5883,7 +5883,7 @@
       <w:tr>
         <w:tc>
           <w:tcPr>
-            <w:tcW w:type="dxa" w:w="1064"/>
+            <w:tcW w:type="dxa" w:w="1063"/>
           </w:tcPr>
           <w:p>
             <w:r/>
@@ -5911,7 +5911,7 @@
         </w:tc>
         <w:tc>
           <w:tcPr>
-            <w:tcW w:type="dxa" w:w="3664"/>
+            <w:tcW w:type="dxa" w:w="3660"/>
           </w:tcPr>
           <w:p>
             <w:r/>
@@ -5925,7 +5925,7 @@
         </w:tc>
         <w:tc>
           <w:tcPr>
-            <w:tcW w:type="dxa" w:w="1156"/>
+            <w:tcW w:type="dxa" w:w="1155"/>
           </w:tcPr>
           <w:p>
             <w:r/>
@@ -5939,7 +5939,7 @@
         </w:tc>
         <w:tc>
           <w:tcPr>
-            <w:tcW w:type="dxa" w:w="3256"/>
+            <w:tcW w:type="dxa" w:w="3261"/>
           </w:tcPr>
           <w:p>
             <w:r/>
@@ -5953,7 +5953,7 @@
         </w:tc>
         <w:tc>
           <w:tcPr>
-            <w:tcW w:type="dxa" w:w="2300"/>
+            <w:tcW w:type="dxa" w:w="2299"/>
           </w:tcPr>
           <w:p>
             <w:r/>
@@ -5967,7 +5967,7 @@
         </w:tc>
         <w:tc>
           <w:tcPr>
-            <w:tcW w:type="dxa" w:w="1198"/>
+            <w:tcW w:type="dxa" w:w="1197"/>
           </w:tcPr>
           <w:p>
             <w:r/>
@@ -5983,7 +5983,7 @@
       <w:tr>
         <w:tc>
           <w:tcPr>
-            <w:tcW w:type="dxa" w:w="1064"/>
+            <w:tcW w:type="dxa" w:w="1063"/>
           </w:tcPr>
           <w:p>
             <w:r/>
@@ -6011,7 +6011,7 @@
         </w:tc>
         <w:tc>
           <w:tcPr>
-            <w:tcW w:type="dxa" w:w="3664"/>
+            <w:tcW w:type="dxa" w:w="3660"/>
           </w:tcPr>
           <w:p>
             <w:r/>
@@ -6025,7 +6025,7 @@
         </w:tc>
         <w:tc>
           <w:tcPr>
-            <w:tcW w:type="dxa" w:w="1156"/>
+            <w:tcW w:type="dxa" w:w="1155"/>
           </w:tcPr>
           <w:p>
             <w:r/>
@@ -6039,7 +6039,7 @@
         </w:tc>
         <w:tc>
           <w:tcPr>
-            <w:tcW w:type="dxa" w:w="3256"/>
+            <w:tcW w:type="dxa" w:w="3261"/>
           </w:tcPr>
           <w:p>
             <w:r/>
@@ -6053,7 +6053,7 @@
         </w:tc>
         <w:tc>
           <w:tcPr>
-            <w:tcW w:type="dxa" w:w="2300"/>
+            <w:tcW w:type="dxa" w:w="2299"/>
           </w:tcPr>
           <w:p>
             <w:r/>
@@ -6067,7 +6067,7 @@
         </w:tc>
         <w:tc>
           <w:tcPr>
-            <w:tcW w:type="dxa" w:w="1198"/>
+            <w:tcW w:type="dxa" w:w="1197"/>
           </w:tcPr>
           <w:p>
             <w:r/>
@@ -6083,7 +6083,7 @@
       <w:tr>
         <w:tc>
           <w:tcPr>
-            <w:tcW w:type="dxa" w:w="1064"/>
+            <w:tcW w:type="dxa" w:w="1063"/>
           </w:tcPr>
           <w:p>
             <w:r/>
@@ -6111,7 +6111,7 @@
         </w:tc>
         <w:tc>
           <w:tcPr>
-            <w:tcW w:type="dxa" w:w="3664"/>
+            <w:tcW w:type="dxa" w:w="3660"/>
           </w:tcPr>
           <w:p>
             <w:r/>
@@ -6125,7 +6125,7 @@
         </w:tc>
         <w:tc>
           <w:tcPr>
-            <w:tcW w:type="dxa" w:w="1156"/>
+            <w:tcW w:type="dxa" w:w="1155"/>
           </w:tcPr>
           <w:p>
             <w:r/>
@@ -6139,7 +6139,7 @@
         </w:tc>
         <w:tc>
           <w:tcPr>
-            <w:tcW w:type="dxa" w:w="3256"/>
+            <w:tcW w:type="dxa" w:w="3261"/>
           </w:tcPr>
           <w:p>
             <w:r/>
@@ -6153,7 +6153,7 @@
         </w:tc>
         <w:tc>
           <w:tcPr>
-            <w:tcW w:type="dxa" w:w="2300"/>
+            <w:tcW w:type="dxa" w:w="2299"/>
           </w:tcPr>
           <w:p>
             <w:r/>
@@ -6167,7 +6167,7 @@
         </w:tc>
         <w:tc>
           <w:tcPr>
-            <w:tcW w:type="dxa" w:w="1198"/>
+            <w:tcW w:type="dxa" w:w="1197"/>
           </w:tcPr>
           <w:p>
             <w:r/>
@@ -6183,7 +6183,7 @@
       <w:tr>
         <w:tc>
           <w:tcPr>
-            <w:tcW w:type="dxa" w:w="1064"/>
+            <w:tcW w:type="dxa" w:w="1063"/>
           </w:tcPr>
           <w:p>
             <w:r/>
@@ -6211,7 +6211,7 @@
         </w:tc>
         <w:tc>
           <w:tcPr>
-            <w:tcW w:type="dxa" w:w="3664"/>
+            <w:tcW w:type="dxa" w:w="3660"/>
           </w:tcPr>
           <w:p>
             <w:r/>
@@ -6225,7 +6225,7 @@
         </w:tc>
         <w:tc>
           <w:tcPr>
-            <w:tcW w:type="dxa" w:w="1156"/>
+            <w:tcW w:type="dxa" w:w="1155"/>
           </w:tcPr>
           <w:p>
             <w:r/>
@@ -6239,7 +6239,7 @@
         </w:tc>
         <w:tc>
           <w:tcPr>
-            <w:tcW w:type="dxa" w:w="3256"/>
+            <w:tcW w:type="dxa" w:w="3261"/>
           </w:tcPr>
           <w:p>
             <w:r/>
@@ -6266,7 +6266,7 @@
         </w:tc>
         <w:tc>
           <w:tcPr>
-            <w:tcW w:type="dxa" w:w="2300"/>
+            <w:tcW w:type="dxa" w:w="2299"/>
           </w:tcPr>
           <w:p>
             <w:r/>
@@ -6280,7 +6280,7 @@
         </w:tc>
         <w:tc>
           <w:tcPr>
-            <w:tcW w:type="dxa" w:w="1198"/>
+            <w:tcW w:type="dxa" w:w="1197"/>
           </w:tcPr>
           <w:p>
             <w:r/>
@@ -6296,7 +6296,7 @@
       <w:tr>
         <w:tc>
           <w:tcPr>
-            <w:tcW w:type="dxa" w:w="1064"/>
+            <w:tcW w:type="dxa" w:w="1063"/>
           </w:tcPr>
           <w:p>
             <w:r/>
@@ -6324,7 +6324,7 @@
         </w:tc>
         <w:tc>
           <w:tcPr>
-            <w:tcW w:type="dxa" w:w="3664"/>
+            <w:tcW w:type="dxa" w:w="3660"/>
           </w:tcPr>
           <w:p>
             <w:r/>
@@ -6338,7 +6338,7 @@
         </w:tc>
         <w:tc>
           <w:tcPr>
-            <w:tcW w:type="dxa" w:w="1156"/>
+            <w:tcW w:type="dxa" w:w="1155"/>
           </w:tcPr>
           <w:p>
             <w:r/>
@@ -6352,7 +6352,7 @@
         </w:tc>
         <w:tc>
           <w:tcPr>
-            <w:tcW w:type="dxa" w:w="3256"/>
+            <w:tcW w:type="dxa" w:w="3261"/>
           </w:tcPr>
           <w:p>
             <w:r/>
@@ -6366,7 +6366,7 @@
         </w:tc>
         <w:tc>
           <w:tcPr>
-            <w:tcW w:type="dxa" w:w="2300"/>
+            <w:tcW w:type="dxa" w:w="2299"/>
           </w:tcPr>
           <w:p>
             <w:r/>
@@ -6380,7 +6380,7 @@
         </w:tc>
         <w:tc>
           <w:tcPr>
-            <w:tcW w:type="dxa" w:w="1198"/>
+            <w:tcW w:type="dxa" w:w="1197"/>
           </w:tcPr>
           <w:p>
             <w:r/>
@@ -6396,7 +6396,7 @@
       <w:tr>
         <w:tc>
           <w:tcPr>
-            <w:tcW w:type="dxa" w:w="1064"/>
+            <w:tcW w:type="dxa" w:w="1063"/>
           </w:tcPr>
           <w:p>
             <w:r/>
@@ -6424,7 +6424,7 @@
         </w:tc>
         <w:tc>
           <w:tcPr>
-            <w:tcW w:type="dxa" w:w="3664"/>
+            <w:tcW w:type="dxa" w:w="3660"/>
           </w:tcPr>
           <w:p>
             <w:r/>
@@ -6438,7 +6438,7 @@
         </w:tc>
         <w:tc>
           <w:tcPr>
-            <w:tcW w:type="dxa" w:w="1156"/>
+            <w:tcW w:type="dxa" w:w="1155"/>
           </w:tcPr>
           <w:p>
             <w:r/>
@@ -6452,7 +6452,7 @@
         </w:tc>
         <w:tc>
           <w:tcPr>
-            <w:tcW w:type="dxa" w:w="3256"/>
+            <w:tcW w:type="dxa" w:w="3261"/>
           </w:tcPr>
           <w:p>
             <w:r/>
@@ -6479,7 +6479,7 @@
         </w:tc>
         <w:tc>
           <w:tcPr>
-            <w:tcW w:type="dxa" w:w="2300"/>
+            <w:tcW w:type="dxa" w:w="2299"/>
           </w:tcPr>
           <w:p>
             <w:r/>
@@ -6493,7 +6493,7 @@
         </w:tc>
         <w:tc>
           <w:tcPr>
-            <w:tcW w:type="dxa" w:w="1198"/>
+            <w:tcW w:type="dxa" w:w="1197"/>
           </w:tcPr>
           <w:p>
             <w:r/>
@@ -6509,7 +6509,7 @@
       <w:tr>
         <w:tc>
           <w:tcPr>
-            <w:tcW w:type="dxa" w:w="1064"/>
+            <w:tcW w:type="dxa" w:w="1063"/>
           </w:tcPr>
           <w:p>
             <w:r/>
@@ -6537,7 +6537,7 @@
         </w:tc>
         <w:tc>
           <w:tcPr>
-            <w:tcW w:type="dxa" w:w="3664"/>
+            <w:tcW w:type="dxa" w:w="3660"/>
           </w:tcPr>
           <w:p>
             <w:r/>
@@ -6564,7 +6564,7 @@
         </w:tc>
         <w:tc>
           <w:tcPr>
-            <w:tcW w:type="dxa" w:w="1156"/>
+            <w:tcW w:type="dxa" w:w="1155"/>
           </w:tcPr>
           <w:p>
             <w:r/>
@@ -6578,7 +6578,7 @@
         </w:tc>
         <w:tc>
           <w:tcPr>
-            <w:tcW w:type="dxa" w:w="3256"/>
+            <w:tcW w:type="dxa" w:w="3261"/>
           </w:tcPr>
           <w:p>
             <w:r/>
@@ -6605,7 +6605,7 @@
         </w:tc>
         <w:tc>
           <w:tcPr>
-            <w:tcW w:type="dxa" w:w="2300"/>
+            <w:tcW w:type="dxa" w:w="2299"/>
           </w:tcPr>
           <w:p>
             <w:r/>
@@ -6619,7 +6619,7 @@
         </w:tc>
         <w:tc>
           <w:tcPr>
-            <w:tcW w:type="dxa" w:w="1198"/>
+            <w:tcW w:type="dxa" w:w="1197"/>
           </w:tcPr>
           <w:p>
             <w:r/>
@@ -19484,7 +19484,7 @@
         <w:rPr>
           <w:rFonts w:ascii="Consolas" w:hAnsi="Consolas"/>
         </w:rPr>
-        <w:t>Documents/SAD.md</w:t>
+        <w:t>Documents/markdown/SAD.md</w:t>
       </w:r>
       <w:r>
         <w:t>).</w:t>
@@ -19710,7 +19710,7 @@
         </w:trPr>
         <w:tc>
           <w:tcPr>
-            <w:tcW w:type="dxa" w:w="9180"/>
+            <w:tcW w:type="dxa" w:w="8659"/>
             <w:shd w:val="clear" w:color="auto" w:fill="D9E2F3"/>
           </w:tcPr>
           <w:p>
@@ -19730,7 +19730,7 @@
         </w:tc>
         <w:tc>
           <w:tcPr>
-            <w:tcW w:type="dxa" w:w="5618"/>
+            <w:tcW w:type="dxa" w:w="6139"/>
             <w:shd w:val="clear" w:color="auto" w:fill="D9E2F3"/>
           </w:tcPr>
           <w:p>
@@ -19752,7 +19752,7 @@
       <w:tr>
         <w:tc>
           <w:tcPr>
-            <w:tcW w:type="dxa" w:w="9180"/>
+            <w:tcW w:type="dxa" w:w="8659"/>
           </w:tcPr>
           <w:p>
             <w:r/>
@@ -19766,7 +19766,7 @@
         </w:tc>
         <w:tc>
           <w:tcPr>
-            <w:tcW w:type="dxa" w:w="5618"/>
+            <w:tcW w:type="dxa" w:w="6139"/>
           </w:tcPr>
           <w:p>
             <w:r/>
@@ -19789,7 +19789,7 @@
       <w:tr>
         <w:tc>
           <w:tcPr>
-            <w:tcW w:type="dxa" w:w="9180"/>
+            <w:tcW w:type="dxa" w:w="8659"/>
           </w:tcPr>
           <w:p>
             <w:r/>
@@ -19803,7 +19803,7 @@
         </w:tc>
         <w:tc>
           <w:tcPr>
-            <w:tcW w:type="dxa" w:w="5618"/>
+            <w:tcW w:type="dxa" w:w="6139"/>
           </w:tcPr>
           <w:p>
             <w:r/>
@@ -19812,7 +19812,7 @@
                 <w:rFonts w:ascii="Consolas" w:hAnsi="Consolas"/>
                 <w:sz w:val="18"/>
               </w:rPr>
-              <w:t>Documents/Sprint_Plan.md</w:t>
+              <w:t>Documents/markdown/Sprint_Plan.md</w:t>
             </w:r>
           </w:p>
         </w:tc>
@@ -19820,7 +19820,7 @@
       <w:tr>
         <w:tc>
           <w:tcPr>
-            <w:tcW w:type="dxa" w:w="9180"/>
+            <w:tcW w:type="dxa" w:w="8659"/>
           </w:tcPr>
           <w:p>
             <w:r/>
@@ -19834,7 +19834,7 @@
         </w:tc>
         <w:tc>
           <w:tcPr>
-            <w:tcW w:type="dxa" w:w="5618"/>
+            <w:tcW w:type="dxa" w:w="6139"/>
           </w:tcPr>
           <w:p>
             <w:r/>
@@ -19843,7 +19843,7 @@
                 <w:rFonts w:ascii="Consolas" w:hAnsi="Consolas"/>
                 <w:sz w:val="18"/>
               </w:rPr>
-              <w:t>Documents/SAD.md</w:t>
+              <w:t>Documents/markdown/SAD.md</w:t>
             </w:r>
           </w:p>
         </w:tc>
@@ -19851,7 +19851,7 @@
       <w:tr>
         <w:tc>
           <w:tcPr>
-            <w:tcW w:type="dxa" w:w="9180"/>
+            <w:tcW w:type="dxa" w:w="8659"/>
           </w:tcPr>
           <w:p>
             <w:r/>
@@ -19865,7 +19865,7 @@
         </w:tc>
         <w:tc>
           <w:tcPr>
-            <w:tcW w:type="dxa" w:w="5618"/>
+            <w:tcW w:type="dxa" w:w="6139"/>
           </w:tcPr>
           <w:p>
             <w:r/>
@@ -19874,7 +19874,7 @@
                 <w:rFonts w:ascii="Consolas" w:hAnsi="Consolas"/>
                 <w:sz w:val="18"/>
               </w:rPr>
-              <w:t>Documents/Test_Plan.md</w:t>
+              <w:t>Documents/markdown/Test_Plan.md</w:t>
             </w:r>
           </w:p>
         </w:tc>

</xml_diff>